<commit_message>
subimos principio de octubre
</commit_message>
<xml_diff>
--- a/BRISAS/CERTIFICADO LIBRE DEUDA - COMPLETO.docx
+++ b/BRISAS/CERTIFICADO LIBRE DEUDA - COMPLETO.docx
@@ -63,16 +63,7 @@
         <w:t xml:space="preserve">En mi carácter de Administradora del Consorcio de Propietarios “Las Brisas”, con domicilio en la ciudad de Adrogué, Provincia de Buenos Aires, CUIT N.º 30-71618269-6, y conforme a lo dispuesto por la Ley 13.512, certifico que el Lote N.º </w:t>
       </w:r>
       <w:r>
-        <w:t>104</w:t>
-      </w:r>
-      <w:r>
-        <w:t xml:space="preserve">, </w:t>
-      </w:r>
-      <w:r>
-        <w:t>Partida Inmobiliaria N.º 003-01780</w:t>
-      </w:r>
-      <w:r>
-        <w:t>67</w:t>
+        <w:t>27</w:t>
       </w:r>
       <w:r>
         <w:t>,</w:t>
@@ -81,19 +72,19 @@
         <w:t xml:space="preserve"> destinado a vivienda, cuya titularidad corresponde al Sr. </w:t>
       </w:r>
       <w:r>
-        <w:t>Daniel Perfumo</w:t>
+        <w:t>MONTERO, PABLO</w:t>
       </w:r>
       <w:r>
         <w:t xml:space="preserve">, no registra deuda alguna en concepto de expensas comunes ordinarias ni extraordinarias al día </w:t>
       </w:r>
       <w:r>
-        <w:t>25</w:t>
+        <w:t>22</w:t>
       </w:r>
       <w:r>
         <w:t xml:space="preserve"> de </w:t>
       </w:r>
       <w:r>
-        <w:t>junio</w:t>
+        <w:t>octubre</w:t>
       </w:r>
       <w:r>
         <w:t xml:space="preserve"> de 2026.</w:t>

</xml_diff>